<commit_message>
Refine resume copy and preserve existing design
</commit_message>
<xml_diff>
--- a/public/kartik-jangid-resume.docx
+++ b/public/kartik-jangid-resume.docx
@@ -124,6 +124,7 @@
     </w:p>
     <w:p>
       <w:pPr>
+        <w:keepNext/>
         <w:pBdr>
           <w:bottom w:color="000000" w:space="1" w:sz="4" w:val="single"/>
         </w:pBdr>
@@ -166,46 +167,19 @@
           <w:rFonts w:ascii="Times New Roman" w:cs="Times New Roman" w:eastAsia="Times New Roman" w:hAnsi="Times New Roman"/>
           <w:rtl w:val="0"/>
         </w:rPr>
-        <w:t xml:space="preserve">Founding-level product designer who identifies problems before being asked, proposes solutions, and ships without waiting. At Smartify, I joined, ran unsolicited usability tests, diagnosed broken flows, and drove a full product redesign and strategic pivot that generated Reepl's first paid revenue and cut bounce rate from ~80% to 59% across 1M+ visitors. I own design end-to-end: research, strategy, systems, components, and outcomes. I think in activation flows and conversion funnels as much as in interfaces.</w:t>
-      </w:r>
-    </w:p>
-    <w:p>
-      <w:pPr>
-        <w:spacing w:line="240" w:lineRule="auto"/>
-        <w:ind w:left="0" w:firstLine="0"/>
-        <w:rPr>
-          <w:rFonts w:ascii="Times New Roman" w:cs="Times New Roman" w:eastAsia="Times New Roman" w:hAnsi="Times New Roman"/>
-        </w:rPr>
-      </w:pPr>
-      <w:r>
-        <w:rPr>
-          <w:rtl w:val="0"/>
-        </w:rPr>
-      </w:r>
-    </w:p>
-    <w:p>
-      <w:pPr>
-        <w:spacing w:line="240" w:lineRule="auto"/>
-        <w:ind w:left="360" w:firstLine="0"/>
-        <w:rPr>
-          <w:rFonts w:ascii="Times New Roman" w:cs="Times New Roman" w:eastAsia="Times New Roman" w:hAnsi="Times New Roman"/>
-        </w:rPr>
-      </w:pPr>
-      <w:r>
-        <w:rPr>
-          <w:rtl w:val="0"/>
-        </w:rPr>
-      </w:r>
-    </w:p>
-    <w:p>
-      <w:pPr>
+        <w:t>Product designer at Smartify focused on AI SaaS, mobile apps, and design systems. I own research, interaction design, and implementation for Reepl’s onboarding and native mobile experience.</w:t>
+      </w:r>
+    </w:p>
+    <w:p>
+      <w:pPr>
+        <w:keepNext/>
         <w:pBdr>
           <w:bottom w:color="000000" w:space="1" w:sz="4" w:val="single"/>
         </w:pBdr>
         <w:tabs>
           <w:tab w:val="right" w:leader="none" w:pos="10627"/>
         </w:tabs>
-        <w:spacing w:line="240" w:lineRule="auto"/>
+        <w:spacing w:line="240" w:lineRule="auto" w:before="120"/>
         <w:rPr>
           <w:rFonts w:ascii="Times New Roman" w:cs="Times New Roman" w:eastAsia="Times New Roman" w:hAnsi="Times New Roman"/>
           <w:b w:val="1"/>
@@ -231,8 +205,9 @@
     </w:p>
     <w:p>
       <w:pPr>
-        <w:tabs>
-          <w:tab w:val="right" w:leader="none" w:pos="10080"/>
+        <w:keepNext/>
+        <w:tabs>
+          <w:tab w:pos="9360" w:val="right"/>
         </w:tabs>
         <w:spacing w:line="220" w:lineRule="auto"/>
         <w:rPr>
@@ -255,8 +230,9 @@
     </w:p>
     <w:p>
       <w:pPr>
-        <w:tabs>
-          <w:tab w:val="right" w:leader="none" w:pos="10080"/>
+        <w:keepNext/>
+        <w:tabs>
+          <w:tab w:pos="9360" w:val="right"/>
         </w:tabs>
         <w:spacing w:line="220" w:lineRule="auto"/>
         <w:rPr>
@@ -272,13 +248,14 @@
           <w:iCs w:val="1"/>
           <w:rtl w:val="0"/>
         </w:rPr>
-        <w:t xml:space="preserve">Product Designer</w:t>
+        <w:t>Product Designer</w:t>
         <w:tab/>
-        <w:t xml:space="preserve">Dec 2024- Present</w:t>
-      </w:r>
-    </w:p>
-    <w:p>
-      <w:pPr>
+        <w:t>Dec 2024 – Present</w:t>
+      </w:r>
+    </w:p>
+    <w:p>
+      <w:pPr>
+        <w:keepLines/>
         <w:numPr>
           <w:ilvl w:val="0"/>
           <w:numId w:val="2"/>
@@ -293,32 +270,12 @@
           <w:highlight w:val="white"/>
           <w:rtl w:val="0"/>
         </w:rPr>
-        <w:t xml:space="preserve">Joined and immediately identified overcomplicated app flows as the core product problem without being asked, ran independent usability tests and user interviews, mapped the broken flows, and prototyped an improved architecture. Brought findings to the CEO and drove the resulting redesign.</w:t>
-      </w:r>
-    </w:p>
-    <w:p>
-      <w:pPr>
-        <w:numPr>
-          <w:ilvl w:val="0"/>
-          <w:numId w:val="2"/>
-        </w:numPr>
-        <w:spacing w:line="240" w:lineRule="auto"/>
-        <w:ind w:left="360" w:hanging="360"/>
-        <w:jc w:val="both"/>
-        <w:rPr>
-          <w:rFonts w:ascii="Times New Roman" w:cs="Times New Roman" w:eastAsia="Times New Roman" w:hAnsi="Times New Roman"/>
-          <w:highlight w:val="white"/>
-          <w:u w:val="none"/>
-        </w:rPr>
-      </w:pPr>
-      <w:r>
-        <w:rPr>
-          <w:rtl w:val="0"/>
-        </w:rPr>
-      </w:r>
-    </w:p>
-    <w:p>
-      <w:pPr>
+        <w:t>Used usability testing and interviews to map workflow problems and propose a revised product architecture to the CEO; redesigned Reepl’s onboarding around product value before plan selection.</w:t>
+      </w:r>
+    </w:p>
+    <w:p>
+      <w:pPr>
+        <w:keepLines/>
         <w:numPr>
           <w:ilvl w:val="0"/>
           <w:numId w:val="2"/>
@@ -334,11 +291,12 @@
           <w:highlight w:val="white"/>
           <w:rtl w:val="0"/>
         </w:rPr>
-        <w:t xml:space="preserve">Revamped key product in 3 months, simplifying multi-step processes; drove growth from 0 to 10+ paying users within 2 months of launch.</w:t>
-      </w:r>
-    </w:p>
-    <w:p>
-      <w:pPr>
+        <w:t>Designed and built Reepl’s native iOS and Android review-and-publish flow using React Native, Expo, and TypeScript; built but not yet in production.</w:t>
+      </w:r>
+    </w:p>
+    <w:p>
+      <w:pPr>
+        <w:keepLines/>
         <w:numPr>
           <w:ilvl w:val="0"/>
           <w:numId w:val="2"/>
@@ -354,11 +312,12 @@
           <w:highlight w:val="white"/>
           <w:rtl w:val="0"/>
         </w:rPr>
-        <w:t xml:space="preserve">Redesigned marketing framer site generating 12,100+ clicks and 430,000+ impressions; redesigned data-heavy interfaces into intuitive visualizations.</w:t>
-      </w:r>
-    </w:p>
-    <w:p>
-      <w:pPr>
+        <w:t>Redesigned the Framer marketing site and clarified data-heavy product screens.</w:t>
+      </w:r>
+    </w:p>
+    <w:p>
+      <w:pPr>
+        <w:keepLines/>
         <w:numPr>
           <w:ilvl w:val="0"/>
           <w:numId w:val="2"/>
@@ -374,11 +333,12 @@
           <w:highlight w:val="white"/>
           <w:rtl w:val="0"/>
         </w:rPr>
-        <w:t xml:space="preserve">Built scalable figma design system with ShadCN + Lucide for rapid, consistent UI development.</w:t>
-      </w:r>
-    </w:p>
-    <w:p>
-      <w:pPr>
+        <w:t>Built a Figma design system with shadcn/ui components and Lucide icons.</w:t>
+      </w:r>
+    </w:p>
+    <w:p>
+      <w:pPr>
+        <w:keepLines/>
         <w:numPr>
           <w:ilvl w:val="0"/>
           <w:numId w:val="2"/>
@@ -394,7 +354,7 @@
           <w:highlight w:val="white"/>
           <w:rtl w:val="0"/>
         </w:rPr>
-        <w:t xml:space="preserve">Bridged design-engineering gap: Coded reusable components, led daily syncs, documented handoffs, mediated priorities, and ensured WCAG accessibility.</w:t>
+        <w:t>Coded reusable UI components and coordinated handoffs and priorities with engineers.</w:t>
       </w:r>
     </w:p>
     <w:p>
@@ -414,10 +374,11 @@
     </w:p>
     <w:p>
       <w:pPr>
-        <w:tabs>
-          <w:tab w:val="right" w:leader="none" w:pos="10080"/>
-        </w:tabs>
-        <w:spacing w:line="220" w:lineRule="auto"/>
+        <w:keepNext/>
+        <w:tabs>
+          <w:tab w:pos="9360" w:val="right"/>
+        </w:tabs>
+        <w:spacing w:line="220" w:lineRule="auto" w:before="120"/>
         <w:rPr>
           <w:rFonts w:ascii="Times New Roman" w:cs="Times New Roman" w:eastAsia="Times New Roman" w:hAnsi="Times New Roman"/>
           <w:b w:val="1"/>
@@ -438,8 +399,9 @@
     </w:p>
     <w:p>
       <w:pPr>
-        <w:tabs>
-          <w:tab w:val="right" w:leader="none" w:pos="10080"/>
+        <w:keepNext/>
+        <w:tabs>
+          <w:tab w:pos="9360" w:val="right"/>
         </w:tabs>
         <w:spacing w:line="220" w:lineRule="auto"/>
         <w:rPr>
@@ -455,13 +417,14 @@
           <w:iCs w:val="1"/>
           <w:rtl w:val="0"/>
         </w:rPr>
-        <w:t xml:space="preserve">UI UX Design Intern</w:t>
+        <w:t>UI/UX Design Intern</w:t>
         <w:tab/>
-        <w:t xml:space="preserve">Feb 2024 - July 2024</w:t>
-      </w:r>
-    </w:p>
-    <w:p>
-      <w:pPr>
+        <w:t>Feb 2024 – Jul 2024</w:t>
+      </w:r>
+    </w:p>
+    <w:p>
+      <w:pPr>
+        <w:keepLines/>
         <w:numPr>
           <w:ilvl w:val="0"/>
           <w:numId w:val="2"/>
@@ -478,11 +441,12 @@
           <w:rFonts w:ascii="Times New Roman" w:cs="Times New Roman" w:eastAsia="Times New Roman" w:hAnsi="Times New Roman"/>
           <w:rtl w:val="0"/>
         </w:rPr>
-        <w:t xml:space="preserve">Designed IoT mobile app for smart home devices (LEDs, locks, switches); created wireframes, prototypes, and customizable control panels.</w:t>
-      </w:r>
-    </w:p>
-    <w:p>
-      <w:pPr>
+        <w:t>Designed wireframes, prototypes, and controls for an IoT app managing smart-home LEDs, locks, and switches.</w:t>
+      </w:r>
+    </w:p>
+    <w:p>
+      <w:pPr>
+        <w:keepLines/>
         <w:numPr>
           <w:ilvl w:val="0"/>
           <w:numId w:val="2"/>
@@ -499,11 +463,12 @@
           <w:rFonts w:ascii="Times New Roman" w:cs="Times New Roman" w:eastAsia="Times New Roman" w:hAnsi="Times New Roman"/>
           <w:rtl w:val="0"/>
         </w:rPr>
-        <w:t xml:space="preserve">Developed atomic design system for scalability and consistency.</w:t>
-      </w:r>
-    </w:p>
-    <w:p>
-      <w:pPr>
+        <w:t>Developed an atomic design system to keep device-control screens consistent.</w:t>
+      </w:r>
+    </w:p>
+    <w:p>
+      <w:pPr>
+        <w:keepLines/>
         <w:numPr>
           <w:ilvl w:val="0"/>
           <w:numId w:val="2"/>
@@ -520,17 +485,16 @@
           <w:rFonts w:ascii="Times New Roman" w:cs="Times New Roman" w:eastAsia="Times New Roman" w:hAnsi="Times New Roman"/>
           <w:rtl w:val="0"/>
         </w:rPr>
-        <w:t xml:space="preserve">Iterated via user testing; collaborated with hardware engineers to translate constraints into intuitive experiences.</w:t>
-      </w:r>
-      <w:r>
-        <w:rPr>
-          <w:rtl w:val="0"/>
-        </w:rPr>
-      </w:r>
-    </w:p>
-    <w:p>
-      <w:pPr>
-        <w:spacing w:line="240" w:lineRule="auto"/>
+        <w:t>Iterated through user testing and worked with hardware engineers to account for device constraints.</w:t>
+      </w:r>
+    </w:p>
+    <w:p>
+      <w:pPr>
+        <w:keepNext/>
+        <w:tabs>
+          <w:tab w:pos="9360" w:val="right"/>
+        </w:tabs>
+        <w:spacing w:line="240" w:lineRule="auto" w:before="120"/>
         <w:ind w:left="0" w:firstLine="0"/>
         <w:jc w:val="both"/>
         <w:rPr>
@@ -542,26 +506,20 @@
       <w:r>
         <w:rPr>
           <w:rFonts w:ascii="Times New Roman" w:cs="Times New Roman" w:eastAsia="Times New Roman" w:hAnsi="Times New Roman"/>
-          <w:rtl w:val="0"/>
-        </w:rPr>
-        <w:br w:type="textWrapping"/>
-      </w:r>
-      <w:r>
-        <w:rPr>
-          <w:rFonts w:ascii="Times New Roman" w:cs="Times New Roman" w:eastAsia="Times New Roman" w:hAnsi="Times New Roman"/>
-          <w:b w:val="1"/>
-          <w:bCs w:val="1"/>
-          <w:rtl w:val="0"/>
-        </w:rPr>
-        <w:t xml:space="preserve">Tutedude</w:t>
+          <w:b w:val="1"/>
+          <w:bCs w:val="1"/>
+          <w:rtl w:val="0"/>
+        </w:rPr>
+        <w:t>Tutedude</w:t>
         <w:tab/>
-        <w:t xml:space="preserve">                                                                                                            Gurugram, Haryana</w:t>
-      </w:r>
-    </w:p>
-    <w:p>
-      <w:pPr>
-        <w:tabs>
-          <w:tab w:val="right" w:leader="none" w:pos="10080"/>
+        <w:t>Gurugram, Haryana</w:t>
+      </w:r>
+    </w:p>
+    <w:p>
+      <w:pPr>
+        <w:keepNext/>
+        <w:tabs>
+          <w:tab w:pos="9360" w:val="right"/>
         </w:tabs>
         <w:spacing w:line="220" w:lineRule="auto"/>
         <w:rPr>
@@ -577,13 +535,14 @@
           <w:iCs w:val="1"/>
           <w:rtl w:val="0"/>
         </w:rPr>
-        <w:t xml:space="preserve">UX Design Intern</w:t>
+        <w:t>UX Design Intern</w:t>
         <w:tab/>
-        <w:t xml:space="preserve">Oct 2023 - Feb 2024</w:t>
-      </w:r>
-    </w:p>
-    <w:p>
-      <w:pPr>
+        <w:t>Oct 2023 – Feb 2024</w:t>
+      </w:r>
+    </w:p>
+    <w:p>
+      <w:pPr>
+        <w:keepLines/>
         <w:numPr>
           <w:ilvl w:val="0"/>
           <w:numId w:val="2"/>
@@ -600,118 +559,34 @@
           <w:rFonts w:ascii="Times New Roman" w:cs="Times New Roman" w:eastAsia="Times New Roman" w:hAnsi="Times New Roman"/>
           <w:rtl w:val="0"/>
         </w:rPr>
-        <w:t xml:space="preserve">Enhanced ed-tech platforms via heuristic evaluations; improved navigation/IA to increase task completion rates.</w:t>
-      </w:r>
-    </w:p>
-    <w:p>
-      <w:pPr>
-        <w:numPr>
-          <w:ilvl w:val="0"/>
-          <w:numId w:val="2"/>
-        </w:numPr>
-        <w:spacing w:line="240" w:lineRule="auto"/>
-        <w:ind w:left="360"/>
-        <w:jc w:val="both"/>
-        <w:rPr>
-          <w:rFonts w:ascii="Times New Roman" w:cs="Times New Roman" w:eastAsia="Times New Roman" w:hAnsi="Times New Roman"/>
-        </w:rPr>
-      </w:pPr>
-      <w:r>
-        <w:rPr>
-          <w:rFonts w:ascii="Times New Roman" w:cs="Times New Roman" w:eastAsia="Times New Roman" w:hAnsi="Times New Roman"/>
-          <w:rtl w:val="0"/>
-        </w:rPr>
-        <w:t xml:space="preserve">Mentored juniors on design principles, prototyping, and Figma.</w:t>
-      </w:r>
-    </w:p>
-    <w:p>
-      <w:pPr>
-        <w:numPr>
-          <w:ilvl w:val="0"/>
-          <w:numId w:val="2"/>
-        </w:numPr>
-        <w:spacing w:line="240" w:lineRule="auto"/>
-        <w:ind w:left="360"/>
-        <w:jc w:val="both"/>
-        <w:rPr>
-          <w:rFonts w:ascii="Times New Roman" w:cs="Times New Roman" w:eastAsia="Times New Roman" w:hAnsi="Times New Roman"/>
-        </w:rPr>
-      </w:pPr>
-      <w:r>
-        <w:rPr>
-          <w:rFonts w:ascii="Times New Roman" w:cs="Times New Roman" w:eastAsia="Times New Roman" w:hAnsi="Times New Roman"/>
-          <w:highlight w:val="white"/>
-          <w:rtl w:val="0"/>
-        </w:rPr>
-        <w:t xml:space="preserve">l and design choices stayed focused on what users needed.</w:t>
-      </w:r>
-    </w:p>
-    <w:p>
-      <w:pPr>
-        <w:spacing w:line="240" w:lineRule="auto"/>
-        <w:ind w:left="360" w:firstLine="0"/>
-        <w:jc w:val="both"/>
-        <w:rPr>
-          <w:rFonts w:ascii="Times New Roman" w:cs="Times New Roman" w:eastAsia="Times New Roman" w:hAnsi="Times New Roman"/>
-          <w:highlight w:val="white"/>
-        </w:rPr>
-      </w:pPr>
-      <w:r>
-        <w:rPr>
-          <w:rtl w:val="0"/>
-        </w:rPr>
-      </w:r>
-    </w:p>
-    <w:p>
-      <w:pPr>
-        <w:spacing w:line="240" w:lineRule="auto"/>
-        <w:rPr>
-          <w:rFonts w:ascii="Times New Roman" w:cs="Times New Roman" w:eastAsia="Times New Roman" w:hAnsi="Times New Roman"/>
-          <w:b w:val="1"/>
-          <w:bCs w:val="1"/>
-        </w:rPr>
-      </w:pPr>
-      <w:r>
-        <w:rPr>
-          <w:rFonts w:ascii="Times New Roman" w:cs="Times New Roman" w:eastAsia="Times New Roman" w:hAnsi="Times New Roman"/>
-          <w:rtl w:val="0"/>
-        </w:rPr>
-        <w:br w:type="textWrapping"/>
-      </w:r>
-      <w:r>
-        <w:rPr>
-          <w:rFonts w:ascii="Times New Roman" w:cs="Times New Roman" w:eastAsia="Times New Roman" w:hAnsi="Times New Roman"/>
-          <w:b w:val="1"/>
-          <w:bCs w:val="1"/>
-          <w:rtl w:val="0"/>
-        </w:rPr>
-        <w:t xml:space="preserve">EDUCATION</w:t>
-      </w:r>
-    </w:p>
-    <w:p>
-      <w:pPr>
-        <w:spacing w:line="240" w:lineRule="auto"/>
-        <w:rPr>
-          <w:rFonts w:ascii="Times New Roman" w:cs="Times New Roman" w:eastAsia="Times New Roman" w:hAnsi="Times New Roman"/>
-          <w:b w:val="1"/>
-          <w:bCs w:val="1"/>
-        </w:rPr>
-      </w:pPr>
-      <w:r>
-        <w:pict>
-          <v:rect style="width:0.0pt;height:1.5pt" o:hr="t" o:hrstd="t" o:hralign="center" fillcolor="#A0A0A0" stroked="f"/>
-        </w:pict>
-      </w:r>
-      <w:r>
-        <w:rPr>
-          <w:rtl w:val="0"/>
-        </w:rPr>
-      </w:r>
-    </w:p>
-    <w:p>
-      <w:pPr>
-        <w:tabs>
-          <w:tab w:val="right" w:leader="none" w:pos="10080"/>
+        <w:t>Evaluated ed-tech navigation and information architecture; proposed clearer task flows.</w:t>
+      </w:r>
+    </w:p>
+    <w:p>
+      <w:pPr>
+        <w:keepNext/>
+        <w:spacing w:line="240" w:lineRule="auto" w:before="120"/>
+        <w:rPr>
+          <w:rFonts w:ascii="Times New Roman" w:cs="Times New Roman" w:eastAsia="Times New Roman" w:hAnsi="Times New Roman"/>
+          <w:b w:val="1"/>
+          <w:bCs w:val="1"/>
+        </w:rPr>
+      </w:pPr>
+      <w:r>
+        <w:rPr>
+          <w:rFonts w:ascii="Times New Roman" w:cs="Times New Roman" w:eastAsia="Times New Roman" w:hAnsi="Times New Roman"/>
+          <w:b w:val="1"/>
+          <w:bCs w:val="1"/>
+          <w:rtl w:val="0"/>
+        </w:rPr>
+        <w:t>EDUCATION</w:t>
+      </w:r>
+    </w:p>
+    <w:p>
+      <w:pPr>
+        <w:keepNext/>
+        <w:tabs>
+          <w:tab w:pos="9360" w:val="right"/>
         </w:tabs>
         <w:spacing w:line="220" w:lineRule="auto"/>
         <w:rPr>
@@ -751,8 +626,9 @@
     </w:p>
     <w:p>
       <w:pPr>
-        <w:tabs>
-          <w:tab w:val="right" w:leader="none" w:pos="10080"/>
+        <w:keepNext/>
+        <w:tabs>
+          <w:tab w:pos="9360" w:val="right"/>
         </w:tabs>
         <w:spacing w:line="220" w:lineRule="auto"/>
         <w:rPr>
@@ -775,23 +651,6 @@
     </w:p>
     <w:p>
       <w:pPr>
-        <w:numPr>
-          <w:ilvl w:val="0"/>
-          <w:numId w:val="1"/>
-        </w:numPr>
-        <w:spacing w:line="240" w:lineRule="auto"/>
-        <w:ind w:left="360"/>
-      </w:pPr>
-      <w:r>
-        <w:rPr>
-          <w:rFonts w:ascii="Times New Roman" w:cs="Times New Roman" w:eastAsia="Times New Roman" w:hAnsi="Times New Roman"/>
-          <w:rtl w:val="0"/>
-        </w:rPr>
-        <w:t xml:space="preserve">7.65 SGPA</w:t>
-      </w:r>
-    </w:p>
-    <w:p>
-      <w:pPr>
         <w:spacing w:line="240" w:lineRule="auto"/>
         <w:ind w:left="0" w:firstLine="0"/>
         <w:jc w:val="both"/>
@@ -807,13 +666,14 @@
     </w:p>
     <w:p>
       <w:pPr>
+        <w:keepNext/>
         <w:pBdr>
           <w:bottom w:color="000000" w:space="1" w:sz="4" w:val="single"/>
         </w:pBdr>
         <w:tabs>
           <w:tab w:val="right" w:leader="none" w:pos="10627"/>
         </w:tabs>
-        <w:spacing w:line="240" w:lineRule="auto"/>
+        <w:spacing w:line="240" w:lineRule="auto" w:before="120"/>
         <w:rPr>
           <w:rFonts w:ascii="Times New Roman" w:cs="Times New Roman" w:eastAsia="Times New Roman" w:hAnsi="Times New Roman"/>
           <w:b w:val="1"/>
@@ -839,6 +699,7 @@
     </w:p>
     <w:p>
       <w:pPr>
+        <w:keepLines/>
         <w:tabs>
           <w:tab w:val="right" w:leader="none" w:pos="9923"/>
         </w:tabs>
@@ -864,11 +725,12 @@
           <w:highlight w:val="white"/>
           <w:rtl w:val="0"/>
         </w:rPr>
-        <w:t xml:space="preserve">User research, usability testing, wireframing, prototyping, interaction design, journey mapping, personas, information architecture, heuristic evaluation, accessibility (WCAG), design systems, Agile</w:t>
-      </w:r>
-    </w:p>
-    <w:p>
-      <w:pPr>
+        <w:t>User research, usability testing, interaction design, prototyping, information architecture, heuristic evaluation, design systems</w:t>
+      </w:r>
+    </w:p>
+    <w:p>
+      <w:pPr>
+        <w:keepLines/>
         <w:tabs>
           <w:tab w:val="right" w:leader="none" w:pos="9923"/>
         </w:tabs>
@@ -894,11 +756,12 @@
           <w:highlight w:val="white"/>
           <w:rtl w:val="0"/>
         </w:rPr>
-        <w:t xml:space="preserve">Figma (expert), FigJam, Adobe XD, Sketch, Maze, ProtoPie, Zeplin, Adobe Creative Suite</w:t>
-      </w:r>
-    </w:p>
-    <w:p>
-      <w:pPr>
+        <w:t>Figma, FigJam, Framer</w:t>
+      </w:r>
+    </w:p>
+    <w:p>
+      <w:pPr>
+        <w:keepLines/>
         <w:tabs>
           <w:tab w:val="right" w:leader="none" w:pos="9923"/>
         </w:tabs>
@@ -924,11 +787,12 @@
           <w:highlight w:val="white"/>
           <w:rtl w:val="0"/>
         </w:rPr>
-        <w:t xml:space="preserve">HTML/CSS, React + Tailwind awareness, front-end constraints, APIs/system thinking</w:t>
-      </w:r>
-    </w:p>
-    <w:p>
-      <w:pPr>
+        <w:t>React Native, Expo, TypeScript, React, HTML/CSS, Tailwind CSS</w:t>
+      </w:r>
+    </w:p>
+    <w:p>
+      <w:pPr>
+        <w:keepLines/>
         <w:tabs>
           <w:tab w:val="right" w:leader="none" w:pos="9923"/>
         </w:tabs>
@@ -954,28 +818,12 @@
           <w:highlight w:val="white"/>
           <w:rtl w:val="0"/>
         </w:rPr>
-        <w:t xml:space="preserve">Cross-functional teams, stakeholder management, documentation, presentations, problem-solving</w:t>
-      </w:r>
-    </w:p>
-    <w:p>
-      <w:pPr>
-        <w:tabs>
-          <w:tab w:val="right" w:leader="none" w:pos="9923"/>
-        </w:tabs>
-        <w:spacing w:after="80" w:line="240" w:lineRule="auto"/>
-        <w:rPr>
-          <w:rFonts w:ascii="Times New Roman" w:cs="Times New Roman" w:eastAsia="Times New Roman" w:hAnsi="Times New Roman"/>
-          <w:highlight w:val="white"/>
-        </w:rPr>
-      </w:pPr>
-      <w:r>
-        <w:rPr>
-          <w:rtl w:val="0"/>
-        </w:rPr>
-      </w:r>
-    </w:p>
-    <w:p>
-      <w:pPr>
+        <w:t>Stakeholder communication, engineering collaboration, handoff documentation</w:t>
+      </w:r>
+    </w:p>
+    <w:p>
+      <w:pPr>
+        <w:keepLines/>
         <w:tabs>
           <w:tab w:val="right" w:leader="none" w:pos="9923"/>
         </w:tabs>
@@ -997,16 +845,9 @@
       </w:r>
       <w:r>
         <w:rPr>
-          <w:rFonts w:ascii="Times New Roman" w:cs="Times New Roman" w:eastAsia="Times New Roman" w:hAnsi="Times New Roman"/>
-          <w:highlight w:val="white"/>
-          <w:rtl w:val="0"/>
-        </w:rPr>
-        <w:t xml:space="preserve">Coffee culture, fitness and boxing, trekking, traveling, reading, and story-driven films.</w:t>
-      </w:r>
-      <w:r>
-        <w:rPr>
-          <w:rtl w:val="0"/>
-        </w:rPr>
+          <w:b w:val="0"/>
+        </w:rPr>
+        <w:t>Boxing, trekking, reading, and films.</w:t>
       </w:r>
     </w:p>
     <w:sectPr>

</xml_diff>